<commit_message>
Brian Tracy Wealth Creation Seminar University of Chicago - Format and Image 1-5
</commit_message>
<xml_diff>
--- a/Brian Tracy/Wealth Creation Seminar University of Chicago/Summary.docx
+++ b/Brian Tracy/Wealth Creation Seminar University of Chicago/Summary.docx
@@ -9,571 +9,1296 @@
           <w:rFonts w:cs="B Nazanin"/>
         </w:rPr>
       </w:pPr>
-      <w:r>
-        <w:rPr>
-          <w:rFonts w:cs="B Nazanin"/>
-          <w:rtl/>
-        </w:rPr>
-        <w:t xml:space="preserve">سخنرانی برایان تریسی در </w:t>
-      </w:r>
-      <w:r>
-        <w:rPr>
-          <w:rFonts w:cs="B Nazanin"/>
-          <w:b/>
-          <w:bCs/>
-          <w:rtl/>
-        </w:rPr>
-        <w:t>همایش خلق ثروت دانشگاه شیکاگو</w:t>
-      </w:r>
-      <w:r>
-        <w:rPr>
-          <w:rFonts w:cs="B Nazanin"/>
-          <w:rtl/>
-        </w:rPr>
-        <w:t xml:space="preserve"> بر محورهای کلیدی موفقیت مالی و فردی متمرکز است. خلاصه‌ای از نکات اصلی او</w:t>
-      </w:r>
-      <w:r>
-        <w:rPr>
-          <w:rFonts w:cs="B Nazanin"/>
-        </w:rPr>
-        <w:t>:</w:t>
-      </w:r>
     </w:p>
-    <w:p>
-      <w:pPr>
-        <w:numPr>
-          <w:ilvl w:val="0"/>
-          <w:numId w:val="1"/>
-        </w:numPr>
-        <w:bidi/>
-        <w:rPr>
-          <w:rFonts w:cs="B Nazanin"/>
-        </w:rPr>
-      </w:pPr>
-      <w:r>
-        <w:rPr>
-          <w:rFonts w:cs="B Nazanin"/>
-          <w:b/>
-          <w:bCs/>
-          <w:rtl/>
-        </w:rPr>
-        <w:t>ذهنیت ثروت</w:t>
-      </w:r>
-    </w:p>
-    <w:p>
-      <w:pPr>
-        <w:numPr>
-          <w:ilvl w:val="1"/>
-          <w:numId w:val="1"/>
-        </w:numPr>
-        <w:bidi/>
-        <w:rPr>
-          <w:rFonts w:cs="B Nazanin"/>
-        </w:rPr>
-      </w:pPr>
-      <w:r>
-        <w:rPr>
-          <w:rFonts w:cs="B Nazanin"/>
-          <w:rtl/>
-        </w:rPr>
-        <w:t>تفاوت اصلی بین افراد موفق و ناموفق در طرز فکرشان است</w:t>
-      </w:r>
-      <w:r>
-        <w:rPr>
-          <w:rFonts w:cs="B Nazanin"/>
-        </w:rPr>
-        <w:t>.</w:t>
-      </w:r>
-    </w:p>
-    <w:p>
-      <w:pPr>
-        <w:numPr>
-          <w:ilvl w:val="1"/>
-          <w:numId w:val="1"/>
-        </w:numPr>
-        <w:bidi/>
-        <w:rPr>
-          <w:rFonts w:cs="B Nazanin"/>
-        </w:rPr>
-      </w:pPr>
-      <w:r>
-        <w:rPr>
-          <w:rFonts w:cs="B Nazanin"/>
-          <w:rtl/>
-        </w:rPr>
-        <w:t>باور به توانایی خود و ایجاد نگرش مثبت نسبت به پول، اساس خلق ثروت است</w:t>
-      </w:r>
-      <w:r>
-        <w:rPr>
-          <w:rFonts w:cs="B Nazanin"/>
-        </w:rPr>
-        <w:t>.</w:t>
-      </w:r>
-    </w:p>
-    <w:p>
-      <w:pPr>
-        <w:numPr>
-          <w:ilvl w:val="0"/>
-          <w:numId w:val="1"/>
-        </w:numPr>
-        <w:bidi/>
-        <w:rPr>
-          <w:rFonts w:cs="B Nazanin"/>
-        </w:rPr>
-      </w:pPr>
-      <w:r>
-        <w:rPr>
-          <w:rFonts w:cs="B Nazanin"/>
-          <w:b/>
-          <w:bCs/>
-          <w:rtl/>
-        </w:rPr>
-        <w:t>هدف‌گذاری شفاف</w:t>
-      </w:r>
-    </w:p>
-    <w:p>
-      <w:pPr>
-        <w:numPr>
-          <w:ilvl w:val="1"/>
-          <w:numId w:val="1"/>
-        </w:numPr>
-        <w:bidi/>
-        <w:rPr>
-          <w:rFonts w:cs="B Nazanin"/>
-        </w:rPr>
-      </w:pPr>
-      <w:r>
-        <w:rPr>
-          <w:rFonts w:cs="B Nazanin"/>
-          <w:rtl/>
-        </w:rPr>
-        <w:t>افراد ثروتمند اهداف مالی مشخص، قابل اندازه‌گیری و زمان‌دار دارند</w:t>
-      </w:r>
-      <w:r>
-        <w:rPr>
-          <w:rFonts w:cs="B Nazanin"/>
-        </w:rPr>
-        <w:t>.</w:t>
-      </w:r>
-    </w:p>
-    <w:p>
-      <w:pPr>
-        <w:numPr>
-          <w:ilvl w:val="1"/>
-          <w:numId w:val="1"/>
-        </w:numPr>
-        <w:bidi/>
-        <w:rPr>
-          <w:rFonts w:cs="B Nazanin"/>
-        </w:rPr>
-      </w:pPr>
-      <w:r>
-        <w:rPr>
-          <w:rFonts w:cs="B Nazanin"/>
-          <w:rtl/>
-        </w:rPr>
-        <w:t>نوشتن اهداف و بازبینی روزانه آن‌ها یک اصل غیرقابل‌جایگزین است</w:t>
-      </w:r>
-      <w:r>
-        <w:rPr>
-          <w:rFonts w:cs="B Nazanin"/>
-        </w:rPr>
-        <w:t>.</w:t>
-      </w:r>
-    </w:p>
-    <w:p>
-      <w:pPr>
-        <w:numPr>
-          <w:ilvl w:val="0"/>
-          <w:numId w:val="1"/>
-        </w:numPr>
-        <w:bidi/>
-        <w:rPr>
-          <w:rFonts w:cs="B Nazanin"/>
-        </w:rPr>
-      </w:pPr>
-      <w:r>
-        <w:rPr>
-          <w:rFonts w:cs="B Nazanin"/>
-          <w:b/>
-          <w:bCs/>
-          <w:rtl/>
-        </w:rPr>
-        <w:t>مدیریت مالی و سرمایه‌گذاری</w:t>
-      </w:r>
-    </w:p>
-    <w:p>
-      <w:pPr>
-        <w:numPr>
-          <w:ilvl w:val="1"/>
-          <w:numId w:val="1"/>
-        </w:numPr>
-        <w:bidi/>
-        <w:rPr>
-          <w:rFonts w:cs="B Nazanin"/>
-        </w:rPr>
-      </w:pPr>
-      <w:r>
-        <w:rPr>
-          <w:rFonts w:cs="B Nazanin"/>
-          <w:rtl/>
-        </w:rPr>
-        <w:t>بخشی از درآمد باید همیشه ذخیره و سرمایه‌گذاری شود</w:t>
-      </w:r>
-      <w:r>
-        <w:rPr>
-          <w:rFonts w:cs="B Nazanin"/>
-        </w:rPr>
-        <w:t>.</w:t>
-      </w:r>
-    </w:p>
-    <w:p>
-      <w:pPr>
-        <w:numPr>
-          <w:ilvl w:val="1"/>
-          <w:numId w:val="1"/>
-        </w:numPr>
-        <w:bidi/>
-        <w:rPr>
-          <w:rFonts w:cs="B Nazanin"/>
-        </w:rPr>
-      </w:pPr>
-      <w:r>
-        <w:rPr>
-          <w:rFonts w:cs="B Nazanin"/>
-          <w:rtl/>
-        </w:rPr>
-        <w:t>انضباط مالی و پرهیز از بدهی غیرضروری عامل اصلی رشد ثروت است</w:t>
-      </w:r>
-      <w:r>
-        <w:rPr>
-          <w:rFonts w:cs="B Nazanin"/>
-        </w:rPr>
-        <w:t>.</w:t>
-      </w:r>
-    </w:p>
-    <w:p>
-      <w:pPr>
-        <w:numPr>
-          <w:ilvl w:val="0"/>
-          <w:numId w:val="1"/>
-        </w:numPr>
-        <w:bidi/>
-        <w:rPr>
-          <w:rFonts w:cs="B Nazanin"/>
-        </w:rPr>
-      </w:pPr>
-      <w:r>
-        <w:rPr>
-          <w:rFonts w:cs="B Nazanin"/>
-          <w:b/>
-          <w:bCs/>
-          <w:rtl/>
-        </w:rPr>
-        <w:t>ارزش‌آفرینی</w:t>
-      </w:r>
-    </w:p>
-    <w:p>
-      <w:pPr>
-        <w:numPr>
-          <w:ilvl w:val="1"/>
-          <w:numId w:val="1"/>
-        </w:numPr>
-        <w:bidi/>
-        <w:rPr>
-          <w:rFonts w:cs="B Nazanin"/>
-        </w:rPr>
-      </w:pPr>
-      <w:r>
-        <w:rPr>
-          <w:rFonts w:cs="B Nazanin"/>
-          <w:rtl/>
-        </w:rPr>
-        <w:t>ثروت به تناسب میزان ارزشی که برای دیگران خلق می‌کنیم افزایش می‌یابد</w:t>
-      </w:r>
-      <w:r>
-        <w:rPr>
-          <w:rFonts w:cs="B Nazanin"/>
-        </w:rPr>
-        <w:t>.</w:t>
-      </w:r>
-    </w:p>
-    <w:p>
-      <w:pPr>
-        <w:numPr>
-          <w:ilvl w:val="1"/>
-          <w:numId w:val="1"/>
-        </w:numPr>
-        <w:bidi/>
-        <w:rPr>
-          <w:rFonts w:cs="B Nazanin"/>
-        </w:rPr>
-      </w:pPr>
-      <w:r>
-        <w:rPr>
-          <w:rFonts w:cs="B Nazanin"/>
-          <w:rtl/>
-        </w:rPr>
-        <w:t>توسعه مهارت‌ها و یادگیری مداوم ابزار کلیدی برای افزایش ارزش شخصی در بازار است</w:t>
-      </w:r>
-      <w:r>
-        <w:rPr>
-          <w:rFonts w:cs="B Nazanin"/>
-        </w:rPr>
-        <w:t>.</w:t>
-      </w:r>
-    </w:p>
-    <w:p>
-      <w:pPr>
-        <w:numPr>
-          <w:ilvl w:val="0"/>
-          <w:numId w:val="1"/>
-        </w:numPr>
-        <w:bidi/>
-        <w:rPr>
-          <w:rFonts w:cs="B Nazanin"/>
-        </w:rPr>
-      </w:pPr>
-      <w:r>
-        <w:rPr>
-          <w:rFonts w:cs="B Nazanin"/>
-          <w:b/>
-          <w:bCs/>
-          <w:rtl/>
-        </w:rPr>
-        <w:t>کار سخت و پشتکار</w:t>
-      </w:r>
-    </w:p>
-    <w:p>
-      <w:pPr>
-        <w:numPr>
-          <w:ilvl w:val="1"/>
-          <w:numId w:val="1"/>
-        </w:numPr>
-        <w:bidi/>
-        <w:rPr>
-          <w:rFonts w:cs="B Nazanin"/>
-        </w:rPr>
-      </w:pPr>
-      <w:r>
-        <w:rPr>
-          <w:rFonts w:cs="B Nazanin"/>
-          <w:rtl/>
-        </w:rPr>
-        <w:t>هیچ جایگزینی برای تلاش متمرکز و منظم وجود ندارد</w:t>
-      </w:r>
-      <w:r>
-        <w:rPr>
-          <w:rFonts w:cs="B Nazanin"/>
-        </w:rPr>
-        <w:t>.</w:t>
-      </w:r>
-    </w:p>
-    <w:p>
-      <w:pPr>
-        <w:numPr>
-          <w:ilvl w:val="1"/>
-          <w:numId w:val="1"/>
-        </w:numPr>
-        <w:bidi/>
-        <w:rPr>
-          <w:rFonts w:cs="B Nazanin"/>
-        </w:rPr>
-      </w:pPr>
-      <w:r>
-        <w:rPr>
-          <w:rFonts w:cs="B Nazanin"/>
-          <w:rtl/>
-        </w:rPr>
-        <w:t>ثروتمندان بیش از دیگران مسئولیت‌پذیر، منظم و پیگیر هستند</w:t>
-      </w:r>
-      <w:r>
-        <w:rPr>
-          <w:rFonts w:cs="B Nazanin"/>
-        </w:rPr>
-        <w:t>.</w:t>
-      </w:r>
-    </w:p>
-    <w:p>
-      <w:pPr>
-        <w:numPr>
-          <w:ilvl w:val="0"/>
-          <w:numId w:val="1"/>
-        </w:numPr>
-        <w:bidi/>
-        <w:rPr>
-          <w:rFonts w:cs="B Nazanin"/>
-        </w:rPr>
-      </w:pPr>
-      <w:r>
-        <w:rPr>
-          <w:rFonts w:cs="B Nazanin"/>
-          <w:b/>
-          <w:bCs/>
-          <w:rtl/>
-        </w:rPr>
-        <w:t>محیط و شبکه‌سازی</w:t>
-      </w:r>
-    </w:p>
-    <w:p>
-      <w:pPr>
-        <w:numPr>
-          <w:ilvl w:val="1"/>
-          <w:numId w:val="1"/>
-        </w:numPr>
-        <w:bidi/>
-        <w:rPr>
-          <w:rFonts w:cs="B Nazanin"/>
-        </w:rPr>
-      </w:pPr>
-      <w:r>
-        <w:rPr>
-          <w:rFonts w:cs="B Nazanin"/>
-          <w:rtl/>
-        </w:rPr>
-        <w:t>افراد موفق با کسانی وقت می‌گذرانند که مثبت‌اندیش، الهام‌بخش و موفق هستند</w:t>
-      </w:r>
-      <w:r>
-        <w:rPr>
-          <w:rFonts w:cs="B Nazanin"/>
-        </w:rPr>
-        <w:t>.</w:t>
-      </w:r>
-    </w:p>
-    <w:p>
-      <w:pPr>
-        <w:numPr>
-          <w:ilvl w:val="1"/>
-          <w:numId w:val="1"/>
-        </w:numPr>
-        <w:bidi/>
-        <w:rPr>
-          <w:rFonts w:cs="B Nazanin"/>
-        </w:rPr>
-      </w:pPr>
-      <w:r>
-        <w:rPr>
-          <w:rFonts w:cs="B Nazanin"/>
-          <w:rtl/>
-        </w:rPr>
-        <w:t>شبکه ارتباطی قوی فرصت‌های بزرگ‌تری برای رشد مالی ایجاد می‌کند</w:t>
-      </w:r>
-      <w:r>
-        <w:rPr>
-          <w:rFonts w:cs="B Nazanin"/>
-        </w:rPr>
-        <w:t>.</w:t>
-      </w:r>
-    </w:p>
-    <w:p>
-      <w:pPr>
-        <w:numPr>
-          <w:ilvl w:val="0"/>
-          <w:numId w:val="1"/>
-        </w:numPr>
-        <w:bidi/>
-        <w:rPr>
-          <w:rFonts w:cs="B Nazanin"/>
-        </w:rPr>
-      </w:pPr>
-      <w:r>
-        <w:rPr>
-          <w:rFonts w:cs="B Nazanin"/>
-          <w:b/>
-          <w:bCs/>
-          <w:rtl/>
-        </w:rPr>
-        <w:t>رهبری بر خود</w:t>
-      </w:r>
-    </w:p>
-    <w:p>
-      <w:pPr>
-        <w:numPr>
-          <w:ilvl w:val="1"/>
-          <w:numId w:val="1"/>
-        </w:numPr>
-        <w:bidi/>
-        <w:rPr>
-          <w:rFonts w:cs="B Nazanin"/>
-        </w:rPr>
-      </w:pPr>
-      <w:r>
-        <w:rPr>
-          <w:rFonts w:cs="B Nazanin"/>
-          <w:rtl/>
-        </w:rPr>
-        <w:t>پیش از رهبری دیگران، باید خود را مدیریت کرد: زمان، انرژی، عادت‌ها و افکار</w:t>
-      </w:r>
-      <w:r>
-        <w:rPr>
-          <w:rFonts w:cs="B Nazanin"/>
-        </w:rPr>
-        <w:t>.</w:t>
-      </w:r>
-    </w:p>
-    <w:p>
-      <w:pPr>
-        <w:numPr>
-          <w:ilvl w:val="1"/>
-          <w:numId w:val="1"/>
-        </w:numPr>
-        <w:bidi/>
-        <w:rPr>
-          <w:rFonts w:cs="B Nazanin"/>
-        </w:rPr>
-      </w:pPr>
-      <w:r>
-        <w:rPr>
-          <w:rFonts w:cs="B Nazanin"/>
-          <w:rtl/>
-        </w:rPr>
-        <w:lastRenderedPageBreak/>
-        <w:t>خودانضباطی پایه اصلی استقلال مالی است</w:t>
-      </w:r>
-      <w:r>
-        <w:rPr>
-          <w:rFonts w:cs="B Nazanin"/>
-        </w:rPr>
-        <w:t>.</w:t>
-      </w:r>
-    </w:p>
-    <w:p>
-      <w:pPr>
-        <w:bidi/>
-        <w:rPr>
-          <w:rFonts w:cs="B Nazanin"/>
-        </w:rPr>
-      </w:pPr>
-      <w:r>
-        <w:rPr>
-          <w:rFonts w:cs="B Nazanin"/>
-          <w:rtl/>
-        </w:rPr>
-        <w:t xml:space="preserve">جمع‌بندی: برایان تریسی تاکید می‌کند که </w:t>
-      </w:r>
-      <w:r>
-        <w:rPr>
-          <w:rFonts w:cs="B Nazanin"/>
-          <w:b/>
-          <w:bCs/>
-          <w:rtl/>
-        </w:rPr>
-        <w:t>خلق ثروت ترکیبی از نگرش درست، هدف‌گذاری دقیق، مدیریت مالی هوشمند، یادگیری مداوم و پشتکار</w:t>
-      </w:r>
-      <w:r>
-        <w:rPr>
-          <w:rFonts w:cs="B Nazanin"/>
-          <w:rtl/>
-        </w:rPr>
-        <w:t xml:space="preserve"> است</w:t>
-      </w:r>
-      <w:r>
-        <w:rPr>
-          <w:rFonts w:cs="B Nazanin"/>
-        </w:rPr>
-        <w:t>.</w:t>
-      </w:r>
-    </w:p>
+    <w:tbl>
+      <w:tblPr>
+        <w:tblStyle w:val="GridTable4-Accent6"/>
+        <w:bidiVisual/>
+        <w:tblW w:w="0" w:type="auto"/>
+        <w:tblLook w:val="04A0" w:firstRow="1" w:lastRow="0" w:firstColumn="1" w:lastColumn="0" w:noHBand="0" w:noVBand="1"/>
+      </w:tblPr>
+      <w:tblGrid>
+        <w:gridCol w:w="264"/>
+        <w:gridCol w:w="8778"/>
+        <w:gridCol w:w="249"/>
+      </w:tblGrid>
+      <w:tr>
+        <w:trPr>
+          <w:cnfStyle w:val="100000000000" w:firstRow="1" w:lastRow="0" w:firstColumn="0" w:lastColumn="0" w:oddVBand="0" w:evenVBand="0" w:oddHBand="0" w:evenHBand="0" w:firstRowFirstColumn="0" w:firstRowLastColumn="0" w:lastRowFirstColumn="0" w:lastRowLastColumn="0"/>
+        </w:trPr>
+        <w:tc>
+          <w:tcPr>
+            <w:cnfStyle w:val="001000000000" w:firstRow="0" w:lastRow="0" w:firstColumn="1" w:lastColumn="0" w:oddVBand="0" w:evenVBand="0" w:oddHBand="0" w:evenHBand="0" w:firstRowFirstColumn="0" w:firstRowLastColumn="0" w:lastRowFirstColumn="0" w:lastRowLastColumn="0"/>
+            <w:tcW w:w="264" w:type="dxa"/>
+          </w:tcPr>
+          <w:p>
+            <w:pPr>
+              <w:bidi/>
+              <w:rPr>
+                <w:rFonts w:cs="B Nazanin"/>
+                <w:rtl/>
+              </w:rPr>
+            </w:pPr>
+          </w:p>
+        </w:tc>
+        <w:tc>
+          <w:tcPr>
+            <w:tcW w:w="8778" w:type="dxa"/>
+          </w:tcPr>
+          <w:p>
+            <w:pPr>
+              <w:bidi/>
+              <w:jc w:val="center"/>
+              <w:cnfStyle w:val="100000000000" w:firstRow="1" w:lastRow="0" w:firstColumn="0" w:lastColumn="0" w:oddVBand="0" w:evenVBand="0" w:oddHBand="0" w:evenHBand="0" w:firstRowFirstColumn="0" w:firstRowLastColumn="0" w:lastRowFirstColumn="0" w:lastRowLastColumn="0"/>
+              <w:rPr>
+                <w:rFonts w:cs="B Nazanin"/>
+                <w:rtl/>
+              </w:rPr>
+            </w:pPr>
+            <w:r>
+              <w:rPr>
+                <w:rFonts w:cs="B Nazanin"/>
+                <w:rtl/>
+              </w:rPr>
+              <w:t>سخنرانی برایان تریسی در همایش خلق ثروت دانشگاه شیکاگو بر محورهای کلیدی موفقیت مالی و فردی متمرکز است.</w:t>
+            </w:r>
+          </w:p>
+        </w:tc>
+        <w:tc>
+          <w:tcPr>
+            <w:tcW w:w="249" w:type="dxa"/>
+          </w:tcPr>
+          <w:p>
+            <w:pPr>
+              <w:bidi/>
+              <w:cnfStyle w:val="100000000000" w:firstRow="1" w:lastRow="0" w:firstColumn="0" w:lastColumn="0" w:oddVBand="0" w:evenVBand="0" w:oddHBand="0" w:evenHBand="0" w:firstRowFirstColumn="0" w:firstRowLastColumn="0" w:lastRowFirstColumn="0" w:lastRowLastColumn="0"/>
+              <w:rPr>
+                <w:rFonts w:cs="B Nazanin"/>
+                <w:rtl/>
+              </w:rPr>
+            </w:pPr>
+          </w:p>
+        </w:tc>
+      </w:tr>
+      <w:tr>
+        <w:trPr>
+          <w:cnfStyle w:val="000000100000" w:firstRow="0" w:lastRow="0" w:firstColumn="0" w:lastColumn="0" w:oddVBand="0" w:evenVBand="0" w:oddHBand="1" w:evenHBand="0" w:firstRowFirstColumn="0" w:firstRowLastColumn="0" w:lastRowFirstColumn="0" w:lastRowLastColumn="0"/>
+        </w:trPr>
+        <w:tc>
+          <w:tcPr>
+            <w:cnfStyle w:val="001000000000" w:firstRow="0" w:lastRow="0" w:firstColumn="1" w:lastColumn="0" w:oddVBand="0" w:evenVBand="0" w:oddHBand="0" w:evenHBand="0" w:firstRowFirstColumn="0" w:firstRowLastColumn="0" w:lastRowFirstColumn="0" w:lastRowLastColumn="0"/>
+            <w:tcW w:w="264" w:type="dxa"/>
+            <w:tcBorders>
+              <w:right w:val="nil"/>
+            </w:tcBorders>
+          </w:tcPr>
+          <w:p>
+            <w:pPr>
+              <w:bidi/>
+              <w:rPr>
+                <w:rFonts w:cs="B Nazanin"/>
+                <w:rtl/>
+              </w:rPr>
+            </w:pPr>
+          </w:p>
+        </w:tc>
+        <w:tc>
+          <w:tcPr>
+            <w:tcW w:w="8778" w:type="dxa"/>
+            <w:tcBorders>
+              <w:left w:val="nil"/>
+              <w:right w:val="nil"/>
+            </w:tcBorders>
+          </w:tcPr>
+          <w:p>
+            <w:pPr>
+              <w:bidi/>
+              <w:cnfStyle w:val="000000100000" w:firstRow="0" w:lastRow="0" w:firstColumn="0" w:lastColumn="0" w:oddVBand="0" w:evenVBand="0" w:oddHBand="1" w:evenHBand="0" w:firstRowFirstColumn="0" w:firstRowLastColumn="0" w:lastRowFirstColumn="0" w:lastRowLastColumn="0"/>
+              <w:rPr>
+                <w:rFonts w:cs="B Nazanin"/>
+                <w:rtl/>
+              </w:rPr>
+            </w:pPr>
+            <w:r>
+              <w:rPr>
+                <w:rFonts w:cs="B Nazanin"/>
+                <w:rtl/>
+              </w:rPr>
+              <w:t>خلاصه‌ای از نکات اصلی او</w:t>
+            </w:r>
+            <w:r>
+              <w:rPr>
+                <w:rFonts w:cs="B Nazanin"/>
+              </w:rPr>
+              <w:t>:</w:t>
+            </w:r>
+          </w:p>
+        </w:tc>
+        <w:tc>
+          <w:tcPr>
+            <w:tcW w:w="249" w:type="dxa"/>
+            <w:tcBorders>
+              <w:left w:val="nil"/>
+            </w:tcBorders>
+          </w:tcPr>
+          <w:p>
+            <w:pPr>
+              <w:bidi/>
+              <w:cnfStyle w:val="000000100000" w:firstRow="0" w:lastRow="0" w:firstColumn="0" w:lastColumn="0" w:oddVBand="0" w:evenVBand="0" w:oddHBand="1" w:evenHBand="0" w:firstRowFirstColumn="0" w:firstRowLastColumn="0" w:lastRowFirstColumn="0" w:lastRowLastColumn="0"/>
+              <w:rPr>
+                <w:rFonts w:cs="B Nazanin"/>
+                <w:rtl/>
+              </w:rPr>
+            </w:pPr>
+          </w:p>
+        </w:tc>
+      </w:tr>
+      <w:tr>
+        <w:tc>
+          <w:tcPr>
+            <w:cnfStyle w:val="001000000000" w:firstRow="0" w:lastRow="0" w:firstColumn="1" w:lastColumn="0" w:oddVBand="0" w:evenVBand="0" w:oddHBand="0" w:evenHBand="0" w:firstRowFirstColumn="0" w:firstRowLastColumn="0" w:lastRowFirstColumn="0" w:lastRowLastColumn="0"/>
+            <w:tcW w:w="264" w:type="dxa"/>
+            <w:tcBorders>
+              <w:right w:val="nil"/>
+            </w:tcBorders>
+          </w:tcPr>
+          <w:p>
+            <w:pPr>
+              <w:bidi/>
+              <w:rPr>
+                <w:rFonts w:cs="B Nazanin"/>
+                <w:rtl/>
+              </w:rPr>
+            </w:pPr>
+          </w:p>
+        </w:tc>
+        <w:tc>
+          <w:tcPr>
+            <w:tcW w:w="8778" w:type="dxa"/>
+            <w:tcBorders>
+              <w:left w:val="nil"/>
+              <w:right w:val="nil"/>
+            </w:tcBorders>
+          </w:tcPr>
+          <w:p>
+            <w:pPr>
+              <w:numPr>
+                <w:ilvl w:val="0"/>
+                <w:numId w:val="1"/>
+              </w:numPr>
+              <w:bidi/>
+              <w:cnfStyle w:val="000000000000" w:firstRow="0" w:lastRow="0" w:firstColumn="0" w:lastColumn="0" w:oddVBand="0" w:evenVBand="0" w:oddHBand="0" w:evenHBand="0" w:firstRowFirstColumn="0" w:firstRowLastColumn="0" w:lastRowFirstColumn="0" w:lastRowLastColumn="0"/>
+              <w:rPr>
+                <w:rFonts w:cs="B Nazanin"/>
+              </w:rPr>
+            </w:pPr>
+            <w:r>
+              <w:rPr>
+                <w:rFonts w:cs="B Nazanin"/>
+                <w:b/>
+                <w:bCs/>
+                <w:rtl/>
+              </w:rPr>
+              <w:t>ذهنیت ثروت</w:t>
+            </w:r>
+          </w:p>
+          <w:p>
+            <w:pPr>
+              <w:numPr>
+                <w:ilvl w:val="1"/>
+                <w:numId w:val="1"/>
+              </w:numPr>
+              <w:bidi/>
+              <w:cnfStyle w:val="000000000000" w:firstRow="0" w:lastRow="0" w:firstColumn="0" w:lastColumn="0" w:oddVBand="0" w:evenVBand="0" w:oddHBand="0" w:evenHBand="0" w:firstRowFirstColumn="0" w:firstRowLastColumn="0" w:lastRowFirstColumn="0" w:lastRowLastColumn="0"/>
+              <w:rPr>
+                <w:rFonts w:cs="B Nazanin"/>
+              </w:rPr>
+            </w:pPr>
+            <w:r>
+              <w:rPr>
+                <w:rFonts w:cs="B Nazanin"/>
+                <w:rtl/>
+              </w:rPr>
+              <w:t>تفاوت اصلی بین افراد موفق و ناموفق در طرز فکرشان است</w:t>
+            </w:r>
+            <w:r>
+              <w:rPr>
+                <w:rFonts w:cs="B Nazanin"/>
+              </w:rPr>
+              <w:t>.</w:t>
+            </w:r>
+          </w:p>
+          <w:p>
+            <w:pPr>
+              <w:numPr>
+                <w:ilvl w:val="1"/>
+                <w:numId w:val="1"/>
+              </w:numPr>
+              <w:bidi/>
+              <w:cnfStyle w:val="000000000000" w:firstRow="0" w:lastRow="0" w:firstColumn="0" w:lastColumn="0" w:oddVBand="0" w:evenVBand="0" w:oddHBand="0" w:evenHBand="0" w:firstRowFirstColumn="0" w:firstRowLastColumn="0" w:lastRowFirstColumn="0" w:lastRowLastColumn="0"/>
+              <w:rPr>
+                <w:rFonts w:cs="B Nazanin"/>
+                <w:rtl/>
+              </w:rPr>
+            </w:pPr>
+            <w:r>
+              <w:rPr>
+                <w:rFonts w:cs="B Nazanin"/>
+                <w:rtl/>
+              </w:rPr>
+              <w:t>باور به توانایی خود و ایجاد نگرش مثبت نسبت به پول، اساس خلق ثروت است</w:t>
+            </w:r>
+            <w:r>
+              <w:rPr>
+                <w:rFonts w:cs="B Nazanin"/>
+              </w:rPr>
+              <w:t>.</w:t>
+            </w:r>
+          </w:p>
+        </w:tc>
+        <w:tc>
+          <w:tcPr>
+            <w:tcW w:w="249" w:type="dxa"/>
+            <w:tcBorders>
+              <w:left w:val="nil"/>
+            </w:tcBorders>
+          </w:tcPr>
+          <w:p>
+            <w:pPr>
+              <w:bidi/>
+              <w:cnfStyle w:val="000000000000" w:firstRow="0" w:lastRow="0" w:firstColumn="0" w:lastColumn="0" w:oddVBand="0" w:evenVBand="0" w:oddHBand="0" w:evenHBand="0" w:firstRowFirstColumn="0" w:firstRowLastColumn="0" w:lastRowFirstColumn="0" w:lastRowLastColumn="0"/>
+              <w:rPr>
+                <w:rFonts w:cs="B Nazanin"/>
+                <w:rtl/>
+              </w:rPr>
+            </w:pPr>
+          </w:p>
+        </w:tc>
+      </w:tr>
+      <w:tr>
+        <w:trPr>
+          <w:cnfStyle w:val="000000100000" w:firstRow="0" w:lastRow="0" w:firstColumn="0" w:lastColumn="0" w:oddVBand="0" w:evenVBand="0" w:oddHBand="1" w:evenHBand="0" w:firstRowFirstColumn="0" w:firstRowLastColumn="0" w:lastRowFirstColumn="0" w:lastRowLastColumn="0"/>
+        </w:trPr>
+        <w:tc>
+          <w:tcPr>
+            <w:cnfStyle w:val="001000000000" w:firstRow="0" w:lastRow="0" w:firstColumn="1" w:lastColumn="0" w:oddVBand="0" w:evenVBand="0" w:oddHBand="0" w:evenHBand="0" w:firstRowFirstColumn="0" w:firstRowLastColumn="0" w:lastRowFirstColumn="0" w:lastRowLastColumn="0"/>
+            <w:tcW w:w="264" w:type="dxa"/>
+            <w:tcBorders>
+              <w:right w:val="nil"/>
+            </w:tcBorders>
+          </w:tcPr>
+          <w:p>
+            <w:pPr>
+              <w:bidi/>
+              <w:rPr>
+                <w:rFonts w:cs="B Nazanin"/>
+                <w:rtl/>
+              </w:rPr>
+            </w:pPr>
+          </w:p>
+        </w:tc>
+        <w:tc>
+          <w:tcPr>
+            <w:tcW w:w="8778" w:type="dxa"/>
+            <w:tcBorders>
+              <w:left w:val="nil"/>
+              <w:right w:val="nil"/>
+            </w:tcBorders>
+          </w:tcPr>
+          <w:p>
+            <w:pPr>
+              <w:numPr>
+                <w:ilvl w:val="0"/>
+                <w:numId w:val="1"/>
+              </w:numPr>
+              <w:bidi/>
+              <w:cnfStyle w:val="000000100000" w:firstRow="0" w:lastRow="0" w:firstColumn="0" w:lastColumn="0" w:oddVBand="0" w:evenVBand="0" w:oddHBand="1" w:evenHBand="0" w:firstRowFirstColumn="0" w:firstRowLastColumn="0" w:lastRowFirstColumn="0" w:lastRowLastColumn="0"/>
+              <w:rPr>
+                <w:rFonts w:cs="B Nazanin"/>
+              </w:rPr>
+            </w:pPr>
+            <w:r>
+              <w:rPr>
+                <w:rFonts w:cs="B Nazanin"/>
+                <w:b/>
+                <w:bCs/>
+                <w:rtl/>
+              </w:rPr>
+              <w:t>هدف‌گذاری شفاف</w:t>
+            </w:r>
+          </w:p>
+          <w:p>
+            <w:pPr>
+              <w:numPr>
+                <w:ilvl w:val="1"/>
+                <w:numId w:val="1"/>
+              </w:numPr>
+              <w:bidi/>
+              <w:cnfStyle w:val="000000100000" w:firstRow="0" w:lastRow="0" w:firstColumn="0" w:lastColumn="0" w:oddVBand="0" w:evenVBand="0" w:oddHBand="1" w:evenHBand="0" w:firstRowFirstColumn="0" w:firstRowLastColumn="0" w:lastRowFirstColumn="0" w:lastRowLastColumn="0"/>
+              <w:rPr>
+                <w:rFonts w:cs="B Nazanin"/>
+              </w:rPr>
+            </w:pPr>
+            <w:r>
+              <w:rPr>
+                <w:rFonts w:cs="B Nazanin"/>
+                <w:rtl/>
+              </w:rPr>
+              <w:t>افراد ثروتمند اهداف مالی مشخص، قابل اندازه‌گیری و زمان‌دار دارند</w:t>
+            </w:r>
+            <w:r>
+              <w:rPr>
+                <w:rFonts w:cs="B Nazanin"/>
+              </w:rPr>
+              <w:t>.</w:t>
+            </w:r>
+          </w:p>
+          <w:p>
+            <w:pPr>
+              <w:numPr>
+                <w:ilvl w:val="1"/>
+                <w:numId w:val="1"/>
+              </w:numPr>
+              <w:bidi/>
+              <w:cnfStyle w:val="000000100000" w:firstRow="0" w:lastRow="0" w:firstColumn="0" w:lastColumn="0" w:oddVBand="0" w:evenVBand="0" w:oddHBand="1" w:evenHBand="0" w:firstRowFirstColumn="0" w:firstRowLastColumn="0" w:lastRowFirstColumn="0" w:lastRowLastColumn="0"/>
+              <w:rPr>
+                <w:rFonts w:cs="B Nazanin"/>
+                <w:rtl/>
+              </w:rPr>
+            </w:pPr>
+            <w:r>
+              <w:rPr>
+                <w:rFonts w:cs="B Nazanin"/>
+                <w:rtl/>
+              </w:rPr>
+              <w:t>نوشتن اهداف و بازبینی روزانه آن‌ها یک اصل غیرقابل‌جایگزین است</w:t>
+            </w:r>
+            <w:r>
+              <w:rPr>
+                <w:rFonts w:cs="B Nazanin"/>
+              </w:rPr>
+              <w:t>.</w:t>
+            </w:r>
+          </w:p>
+        </w:tc>
+        <w:tc>
+          <w:tcPr>
+            <w:tcW w:w="249" w:type="dxa"/>
+            <w:tcBorders>
+              <w:left w:val="nil"/>
+            </w:tcBorders>
+          </w:tcPr>
+          <w:p>
+            <w:pPr>
+              <w:bidi/>
+              <w:cnfStyle w:val="000000100000" w:firstRow="0" w:lastRow="0" w:firstColumn="0" w:lastColumn="0" w:oddVBand="0" w:evenVBand="0" w:oddHBand="1" w:evenHBand="0" w:firstRowFirstColumn="0" w:firstRowLastColumn="0" w:lastRowFirstColumn="0" w:lastRowLastColumn="0"/>
+              <w:rPr>
+                <w:rFonts w:cs="B Nazanin"/>
+                <w:rtl/>
+              </w:rPr>
+            </w:pPr>
+          </w:p>
+        </w:tc>
+      </w:tr>
+      <w:tr>
+        <w:tc>
+          <w:tcPr>
+            <w:cnfStyle w:val="001000000000" w:firstRow="0" w:lastRow="0" w:firstColumn="1" w:lastColumn="0" w:oddVBand="0" w:evenVBand="0" w:oddHBand="0" w:evenHBand="0" w:firstRowFirstColumn="0" w:firstRowLastColumn="0" w:lastRowFirstColumn="0" w:lastRowLastColumn="0"/>
+            <w:tcW w:w="264" w:type="dxa"/>
+            <w:tcBorders>
+              <w:right w:val="nil"/>
+            </w:tcBorders>
+          </w:tcPr>
+          <w:p>
+            <w:pPr>
+              <w:bidi/>
+              <w:rPr>
+                <w:rFonts w:cs="B Nazanin"/>
+                <w:rtl/>
+              </w:rPr>
+            </w:pPr>
+          </w:p>
+        </w:tc>
+        <w:tc>
+          <w:tcPr>
+            <w:tcW w:w="8778" w:type="dxa"/>
+            <w:tcBorders>
+              <w:left w:val="nil"/>
+              <w:right w:val="nil"/>
+            </w:tcBorders>
+          </w:tcPr>
+          <w:p>
+            <w:pPr>
+              <w:numPr>
+                <w:ilvl w:val="0"/>
+                <w:numId w:val="1"/>
+              </w:numPr>
+              <w:bidi/>
+              <w:cnfStyle w:val="000000000000" w:firstRow="0" w:lastRow="0" w:firstColumn="0" w:lastColumn="0" w:oddVBand="0" w:evenVBand="0" w:oddHBand="0" w:evenHBand="0" w:firstRowFirstColumn="0" w:firstRowLastColumn="0" w:lastRowFirstColumn="0" w:lastRowLastColumn="0"/>
+              <w:rPr>
+                <w:rFonts w:cs="B Nazanin"/>
+              </w:rPr>
+            </w:pPr>
+            <w:r>
+              <w:rPr>
+                <w:rFonts w:cs="B Nazanin"/>
+                <w:b/>
+                <w:bCs/>
+                <w:rtl/>
+              </w:rPr>
+              <w:t>مدیریت مالی و سرمایه‌گذاری</w:t>
+            </w:r>
+          </w:p>
+          <w:p>
+            <w:pPr>
+              <w:numPr>
+                <w:ilvl w:val="1"/>
+                <w:numId w:val="1"/>
+              </w:numPr>
+              <w:bidi/>
+              <w:cnfStyle w:val="000000000000" w:firstRow="0" w:lastRow="0" w:firstColumn="0" w:lastColumn="0" w:oddVBand="0" w:evenVBand="0" w:oddHBand="0" w:evenHBand="0" w:firstRowFirstColumn="0" w:firstRowLastColumn="0" w:lastRowFirstColumn="0" w:lastRowLastColumn="0"/>
+              <w:rPr>
+                <w:rFonts w:cs="B Nazanin"/>
+              </w:rPr>
+            </w:pPr>
+            <w:r>
+              <w:rPr>
+                <w:rFonts w:cs="B Nazanin"/>
+                <w:rtl/>
+              </w:rPr>
+              <w:t>بخشی از درآمد باید همیشه ذخیره و سرمایه‌گذاری شود</w:t>
+            </w:r>
+            <w:r>
+              <w:rPr>
+                <w:rFonts w:cs="B Nazanin"/>
+              </w:rPr>
+              <w:t>.</w:t>
+            </w:r>
+          </w:p>
+          <w:p>
+            <w:pPr>
+              <w:numPr>
+                <w:ilvl w:val="1"/>
+                <w:numId w:val="1"/>
+              </w:numPr>
+              <w:bidi/>
+              <w:cnfStyle w:val="000000000000" w:firstRow="0" w:lastRow="0" w:firstColumn="0" w:lastColumn="0" w:oddVBand="0" w:evenVBand="0" w:oddHBand="0" w:evenHBand="0" w:firstRowFirstColumn="0" w:firstRowLastColumn="0" w:lastRowFirstColumn="0" w:lastRowLastColumn="0"/>
+              <w:rPr>
+                <w:rFonts w:cs="B Nazanin"/>
+                <w:rtl/>
+              </w:rPr>
+            </w:pPr>
+            <w:r>
+              <w:rPr>
+                <w:rFonts w:cs="B Nazanin"/>
+                <w:rtl/>
+              </w:rPr>
+              <w:t>انضباط مالی و پرهیز از بدهی غیرضروری عامل اصلی رشد ثروت است</w:t>
+            </w:r>
+            <w:r>
+              <w:rPr>
+                <w:rFonts w:cs="B Nazanin"/>
+              </w:rPr>
+              <w:t>.</w:t>
+            </w:r>
+          </w:p>
+        </w:tc>
+        <w:tc>
+          <w:tcPr>
+            <w:tcW w:w="249" w:type="dxa"/>
+            <w:tcBorders>
+              <w:left w:val="nil"/>
+            </w:tcBorders>
+          </w:tcPr>
+          <w:p>
+            <w:pPr>
+              <w:bidi/>
+              <w:cnfStyle w:val="000000000000" w:firstRow="0" w:lastRow="0" w:firstColumn="0" w:lastColumn="0" w:oddVBand="0" w:evenVBand="0" w:oddHBand="0" w:evenHBand="0" w:firstRowFirstColumn="0" w:firstRowLastColumn="0" w:lastRowFirstColumn="0" w:lastRowLastColumn="0"/>
+              <w:rPr>
+                <w:rFonts w:cs="B Nazanin"/>
+                <w:rtl/>
+              </w:rPr>
+            </w:pPr>
+          </w:p>
+        </w:tc>
+      </w:tr>
+      <w:tr>
+        <w:trPr>
+          <w:cnfStyle w:val="000000100000" w:firstRow="0" w:lastRow="0" w:firstColumn="0" w:lastColumn="0" w:oddVBand="0" w:evenVBand="0" w:oddHBand="1" w:evenHBand="0" w:firstRowFirstColumn="0" w:firstRowLastColumn="0" w:lastRowFirstColumn="0" w:lastRowLastColumn="0"/>
+        </w:trPr>
+        <w:tc>
+          <w:tcPr>
+            <w:cnfStyle w:val="001000000000" w:firstRow="0" w:lastRow="0" w:firstColumn="1" w:lastColumn="0" w:oddVBand="0" w:evenVBand="0" w:oddHBand="0" w:evenHBand="0" w:firstRowFirstColumn="0" w:firstRowLastColumn="0" w:lastRowFirstColumn="0" w:lastRowLastColumn="0"/>
+            <w:tcW w:w="264" w:type="dxa"/>
+            <w:tcBorders>
+              <w:right w:val="nil"/>
+            </w:tcBorders>
+          </w:tcPr>
+          <w:p>
+            <w:pPr>
+              <w:bidi/>
+              <w:rPr>
+                <w:rFonts w:cs="B Nazanin"/>
+                <w:rtl/>
+              </w:rPr>
+            </w:pPr>
+          </w:p>
+        </w:tc>
+        <w:tc>
+          <w:tcPr>
+            <w:tcW w:w="8778" w:type="dxa"/>
+            <w:tcBorders>
+              <w:left w:val="nil"/>
+              <w:right w:val="nil"/>
+            </w:tcBorders>
+          </w:tcPr>
+          <w:p>
+            <w:pPr>
+              <w:numPr>
+                <w:ilvl w:val="0"/>
+                <w:numId w:val="1"/>
+              </w:numPr>
+              <w:bidi/>
+              <w:cnfStyle w:val="000000100000" w:firstRow="0" w:lastRow="0" w:firstColumn="0" w:lastColumn="0" w:oddVBand="0" w:evenVBand="0" w:oddHBand="1" w:evenHBand="0" w:firstRowFirstColumn="0" w:firstRowLastColumn="0" w:lastRowFirstColumn="0" w:lastRowLastColumn="0"/>
+              <w:rPr>
+                <w:rFonts w:cs="B Nazanin"/>
+              </w:rPr>
+            </w:pPr>
+            <w:r>
+              <w:rPr>
+                <w:rFonts w:cs="B Nazanin"/>
+                <w:b/>
+                <w:bCs/>
+                <w:rtl/>
+              </w:rPr>
+              <w:t>مدیریت مالی و سرمایه‌گذاری</w:t>
+            </w:r>
+          </w:p>
+          <w:p>
+            <w:pPr>
+              <w:numPr>
+                <w:ilvl w:val="1"/>
+                <w:numId w:val="1"/>
+              </w:numPr>
+              <w:bidi/>
+              <w:cnfStyle w:val="000000100000" w:firstRow="0" w:lastRow="0" w:firstColumn="0" w:lastColumn="0" w:oddVBand="0" w:evenVBand="0" w:oddHBand="1" w:evenHBand="0" w:firstRowFirstColumn="0" w:firstRowLastColumn="0" w:lastRowFirstColumn="0" w:lastRowLastColumn="0"/>
+              <w:rPr>
+                <w:rFonts w:cs="B Nazanin"/>
+              </w:rPr>
+            </w:pPr>
+            <w:r>
+              <w:rPr>
+                <w:rFonts w:cs="B Nazanin"/>
+                <w:rtl/>
+              </w:rPr>
+              <w:t>بخشی از درآمد باید همیشه ذخیره و سرمایه‌گذاری شود</w:t>
+            </w:r>
+            <w:r>
+              <w:rPr>
+                <w:rFonts w:cs="B Nazanin"/>
+              </w:rPr>
+              <w:t>.</w:t>
+            </w:r>
+          </w:p>
+          <w:p>
+            <w:pPr>
+              <w:numPr>
+                <w:ilvl w:val="1"/>
+                <w:numId w:val="1"/>
+              </w:numPr>
+              <w:bidi/>
+              <w:cnfStyle w:val="000000100000" w:firstRow="0" w:lastRow="0" w:firstColumn="0" w:lastColumn="0" w:oddVBand="0" w:evenVBand="0" w:oddHBand="1" w:evenHBand="0" w:firstRowFirstColumn="0" w:firstRowLastColumn="0" w:lastRowFirstColumn="0" w:lastRowLastColumn="0"/>
+              <w:rPr>
+                <w:rFonts w:cs="B Nazanin"/>
+                <w:rtl/>
+              </w:rPr>
+            </w:pPr>
+            <w:r>
+              <w:rPr>
+                <w:rFonts w:cs="B Nazanin"/>
+                <w:rtl/>
+              </w:rPr>
+              <w:t>انضباط مالی و پرهیز از بدهی غیرضروری عامل اصلی رشد ثروت است</w:t>
+            </w:r>
+            <w:r>
+              <w:rPr>
+                <w:rFonts w:cs="B Nazanin"/>
+              </w:rPr>
+              <w:t>.</w:t>
+            </w:r>
+          </w:p>
+        </w:tc>
+        <w:tc>
+          <w:tcPr>
+            <w:tcW w:w="249" w:type="dxa"/>
+            <w:tcBorders>
+              <w:left w:val="nil"/>
+            </w:tcBorders>
+          </w:tcPr>
+          <w:p>
+            <w:pPr>
+              <w:bidi/>
+              <w:cnfStyle w:val="000000100000" w:firstRow="0" w:lastRow="0" w:firstColumn="0" w:lastColumn="0" w:oddVBand="0" w:evenVBand="0" w:oddHBand="1" w:evenHBand="0" w:firstRowFirstColumn="0" w:firstRowLastColumn="0" w:lastRowFirstColumn="0" w:lastRowLastColumn="0"/>
+              <w:rPr>
+                <w:rFonts w:cs="B Nazanin"/>
+                <w:rtl/>
+              </w:rPr>
+            </w:pPr>
+          </w:p>
+        </w:tc>
+      </w:tr>
+      <w:tr>
+        <w:tc>
+          <w:tcPr>
+            <w:cnfStyle w:val="001000000000" w:firstRow="0" w:lastRow="0" w:firstColumn="1" w:lastColumn="0" w:oddVBand="0" w:evenVBand="0" w:oddHBand="0" w:evenHBand="0" w:firstRowFirstColumn="0" w:firstRowLastColumn="0" w:lastRowFirstColumn="0" w:lastRowLastColumn="0"/>
+            <w:tcW w:w="264" w:type="dxa"/>
+            <w:tcBorders>
+              <w:right w:val="nil"/>
+            </w:tcBorders>
+          </w:tcPr>
+          <w:p>
+            <w:pPr>
+              <w:bidi/>
+              <w:rPr>
+                <w:rFonts w:cs="B Nazanin"/>
+                <w:rtl/>
+              </w:rPr>
+            </w:pPr>
+          </w:p>
+        </w:tc>
+        <w:tc>
+          <w:tcPr>
+            <w:tcW w:w="8778" w:type="dxa"/>
+            <w:tcBorders>
+              <w:left w:val="nil"/>
+              <w:right w:val="nil"/>
+            </w:tcBorders>
+          </w:tcPr>
+          <w:p>
+            <w:pPr>
+              <w:numPr>
+                <w:ilvl w:val="0"/>
+                <w:numId w:val="1"/>
+              </w:numPr>
+              <w:bidi/>
+              <w:cnfStyle w:val="000000000000" w:firstRow="0" w:lastRow="0" w:firstColumn="0" w:lastColumn="0" w:oddVBand="0" w:evenVBand="0" w:oddHBand="0" w:evenHBand="0" w:firstRowFirstColumn="0" w:firstRowLastColumn="0" w:lastRowFirstColumn="0" w:lastRowLastColumn="0"/>
+              <w:rPr>
+                <w:rFonts w:cs="B Nazanin"/>
+              </w:rPr>
+            </w:pPr>
+            <w:r>
+              <w:rPr>
+                <w:rFonts w:cs="B Nazanin"/>
+                <w:b/>
+                <w:bCs/>
+                <w:rtl/>
+              </w:rPr>
+              <w:t>ارزش‌آفرینی</w:t>
+            </w:r>
+          </w:p>
+          <w:p>
+            <w:pPr>
+              <w:numPr>
+                <w:ilvl w:val="1"/>
+                <w:numId w:val="1"/>
+              </w:numPr>
+              <w:bidi/>
+              <w:cnfStyle w:val="000000000000" w:firstRow="0" w:lastRow="0" w:firstColumn="0" w:lastColumn="0" w:oddVBand="0" w:evenVBand="0" w:oddHBand="0" w:evenHBand="0" w:firstRowFirstColumn="0" w:firstRowLastColumn="0" w:lastRowFirstColumn="0" w:lastRowLastColumn="0"/>
+              <w:rPr>
+                <w:rFonts w:cs="B Nazanin"/>
+              </w:rPr>
+            </w:pPr>
+            <w:r>
+              <w:rPr>
+                <w:rFonts w:cs="B Nazanin"/>
+                <w:rtl/>
+              </w:rPr>
+              <w:t>ثروت به تناسب میزان ارزشی که برای دیگران خلق می‌کنیم افزایش می‌یابد</w:t>
+            </w:r>
+            <w:r>
+              <w:rPr>
+                <w:rFonts w:cs="B Nazanin"/>
+              </w:rPr>
+              <w:t>.</w:t>
+            </w:r>
+          </w:p>
+          <w:p>
+            <w:pPr>
+              <w:numPr>
+                <w:ilvl w:val="1"/>
+                <w:numId w:val="1"/>
+              </w:numPr>
+              <w:bidi/>
+              <w:cnfStyle w:val="000000000000" w:firstRow="0" w:lastRow="0" w:firstColumn="0" w:lastColumn="0" w:oddVBand="0" w:evenVBand="0" w:oddHBand="0" w:evenHBand="0" w:firstRowFirstColumn="0" w:firstRowLastColumn="0" w:lastRowFirstColumn="0" w:lastRowLastColumn="0"/>
+              <w:rPr>
+                <w:rFonts w:cs="B Nazanin"/>
+                <w:rtl/>
+              </w:rPr>
+            </w:pPr>
+            <w:r>
+              <w:rPr>
+                <w:rFonts w:cs="B Nazanin"/>
+                <w:rtl/>
+              </w:rPr>
+              <w:t>توسعه مهارت‌ها و یادگیری مداوم ابزار کلیدی برای افزایش ارزش شخصی در بازار است</w:t>
+            </w:r>
+            <w:r>
+              <w:rPr>
+                <w:rFonts w:cs="B Nazanin"/>
+              </w:rPr>
+              <w:t>.</w:t>
+            </w:r>
+          </w:p>
+        </w:tc>
+        <w:tc>
+          <w:tcPr>
+            <w:tcW w:w="249" w:type="dxa"/>
+            <w:tcBorders>
+              <w:left w:val="nil"/>
+            </w:tcBorders>
+          </w:tcPr>
+          <w:p>
+            <w:pPr>
+              <w:bidi/>
+              <w:cnfStyle w:val="000000000000" w:firstRow="0" w:lastRow="0" w:firstColumn="0" w:lastColumn="0" w:oddVBand="0" w:evenVBand="0" w:oddHBand="0" w:evenHBand="0" w:firstRowFirstColumn="0" w:firstRowLastColumn="0" w:lastRowFirstColumn="0" w:lastRowLastColumn="0"/>
+              <w:rPr>
+                <w:rFonts w:cs="B Nazanin"/>
+                <w:rtl/>
+              </w:rPr>
+            </w:pPr>
+          </w:p>
+        </w:tc>
+      </w:tr>
+      <w:tr>
+        <w:trPr>
+          <w:cnfStyle w:val="000000100000" w:firstRow="0" w:lastRow="0" w:firstColumn="0" w:lastColumn="0" w:oddVBand="0" w:evenVBand="0" w:oddHBand="1" w:evenHBand="0" w:firstRowFirstColumn="0" w:firstRowLastColumn="0" w:lastRowFirstColumn="0" w:lastRowLastColumn="0"/>
+        </w:trPr>
+        <w:tc>
+          <w:tcPr>
+            <w:cnfStyle w:val="001000000000" w:firstRow="0" w:lastRow="0" w:firstColumn="1" w:lastColumn="0" w:oddVBand="0" w:evenVBand="0" w:oddHBand="0" w:evenHBand="0" w:firstRowFirstColumn="0" w:firstRowLastColumn="0" w:lastRowFirstColumn="0" w:lastRowLastColumn="0"/>
+            <w:tcW w:w="264" w:type="dxa"/>
+            <w:tcBorders>
+              <w:right w:val="nil"/>
+            </w:tcBorders>
+          </w:tcPr>
+          <w:p>
+            <w:pPr>
+              <w:bidi/>
+              <w:rPr>
+                <w:rFonts w:cs="B Nazanin"/>
+                <w:rtl/>
+              </w:rPr>
+            </w:pPr>
+          </w:p>
+        </w:tc>
+        <w:tc>
+          <w:tcPr>
+            <w:tcW w:w="8778" w:type="dxa"/>
+            <w:tcBorders>
+              <w:left w:val="nil"/>
+              <w:right w:val="nil"/>
+            </w:tcBorders>
+          </w:tcPr>
+          <w:p>
+            <w:pPr>
+              <w:numPr>
+                <w:ilvl w:val="0"/>
+                <w:numId w:val="1"/>
+              </w:numPr>
+              <w:bidi/>
+              <w:cnfStyle w:val="000000100000" w:firstRow="0" w:lastRow="0" w:firstColumn="0" w:lastColumn="0" w:oddVBand="0" w:evenVBand="0" w:oddHBand="1" w:evenHBand="0" w:firstRowFirstColumn="0" w:firstRowLastColumn="0" w:lastRowFirstColumn="0" w:lastRowLastColumn="0"/>
+              <w:rPr>
+                <w:rFonts w:cs="B Nazanin"/>
+              </w:rPr>
+            </w:pPr>
+            <w:r>
+              <w:rPr>
+                <w:rFonts w:cs="B Nazanin"/>
+                <w:b/>
+                <w:bCs/>
+                <w:rtl/>
+              </w:rPr>
+              <w:t>کار سخت و پشتکار</w:t>
+            </w:r>
+          </w:p>
+          <w:p>
+            <w:pPr>
+              <w:numPr>
+                <w:ilvl w:val="1"/>
+                <w:numId w:val="1"/>
+              </w:numPr>
+              <w:bidi/>
+              <w:cnfStyle w:val="000000100000" w:firstRow="0" w:lastRow="0" w:firstColumn="0" w:lastColumn="0" w:oddVBand="0" w:evenVBand="0" w:oddHBand="1" w:evenHBand="0" w:firstRowFirstColumn="0" w:firstRowLastColumn="0" w:lastRowFirstColumn="0" w:lastRowLastColumn="0"/>
+              <w:rPr>
+                <w:rFonts w:cs="B Nazanin"/>
+              </w:rPr>
+            </w:pPr>
+            <w:r>
+              <w:rPr>
+                <w:rFonts w:cs="B Nazanin"/>
+                <w:rtl/>
+              </w:rPr>
+              <w:t>هیچ جایگزینی برای تلاش متمرکز و منظم وجود ندارد</w:t>
+            </w:r>
+            <w:r>
+              <w:rPr>
+                <w:rFonts w:cs="B Nazanin"/>
+              </w:rPr>
+              <w:t>.</w:t>
+            </w:r>
+          </w:p>
+          <w:p>
+            <w:pPr>
+              <w:numPr>
+                <w:ilvl w:val="1"/>
+                <w:numId w:val="1"/>
+              </w:numPr>
+              <w:bidi/>
+              <w:cnfStyle w:val="000000100000" w:firstRow="0" w:lastRow="0" w:firstColumn="0" w:lastColumn="0" w:oddVBand="0" w:evenVBand="0" w:oddHBand="1" w:evenHBand="0" w:firstRowFirstColumn="0" w:firstRowLastColumn="0" w:lastRowFirstColumn="0" w:lastRowLastColumn="0"/>
+              <w:rPr>
+                <w:rFonts w:cs="B Nazanin"/>
+                <w:rtl/>
+              </w:rPr>
+            </w:pPr>
+            <w:r>
+              <w:rPr>
+                <w:rFonts w:cs="B Nazanin"/>
+                <w:rtl/>
+              </w:rPr>
+              <w:t>ثروتمندان بیش از دیگران مسئولیت‌پذیر، منظم و پیگیر هستند</w:t>
+            </w:r>
+            <w:r>
+              <w:rPr>
+                <w:rFonts w:cs="B Nazanin"/>
+              </w:rPr>
+              <w:t>.</w:t>
+            </w:r>
+          </w:p>
+        </w:tc>
+        <w:tc>
+          <w:tcPr>
+            <w:tcW w:w="249" w:type="dxa"/>
+            <w:tcBorders>
+              <w:left w:val="nil"/>
+            </w:tcBorders>
+          </w:tcPr>
+          <w:p>
+            <w:pPr>
+              <w:bidi/>
+              <w:cnfStyle w:val="000000100000" w:firstRow="0" w:lastRow="0" w:firstColumn="0" w:lastColumn="0" w:oddVBand="0" w:evenVBand="0" w:oddHBand="1" w:evenHBand="0" w:firstRowFirstColumn="0" w:firstRowLastColumn="0" w:lastRowFirstColumn="0" w:lastRowLastColumn="0"/>
+              <w:rPr>
+                <w:rFonts w:cs="B Nazanin"/>
+                <w:rtl/>
+              </w:rPr>
+            </w:pPr>
+          </w:p>
+        </w:tc>
+      </w:tr>
+      <w:tr>
+        <w:tc>
+          <w:tcPr>
+            <w:cnfStyle w:val="001000000000" w:firstRow="0" w:lastRow="0" w:firstColumn="1" w:lastColumn="0" w:oddVBand="0" w:evenVBand="0" w:oddHBand="0" w:evenHBand="0" w:firstRowFirstColumn="0" w:firstRowLastColumn="0" w:lastRowFirstColumn="0" w:lastRowLastColumn="0"/>
+            <w:tcW w:w="264" w:type="dxa"/>
+            <w:tcBorders>
+              <w:right w:val="nil"/>
+            </w:tcBorders>
+          </w:tcPr>
+          <w:p>
+            <w:pPr>
+              <w:bidi/>
+              <w:rPr>
+                <w:rFonts w:cs="B Nazanin"/>
+                <w:rtl/>
+              </w:rPr>
+            </w:pPr>
+          </w:p>
+        </w:tc>
+        <w:tc>
+          <w:tcPr>
+            <w:tcW w:w="8778" w:type="dxa"/>
+            <w:tcBorders>
+              <w:left w:val="nil"/>
+              <w:right w:val="nil"/>
+            </w:tcBorders>
+          </w:tcPr>
+          <w:p>
+            <w:pPr>
+              <w:numPr>
+                <w:ilvl w:val="0"/>
+                <w:numId w:val="1"/>
+              </w:numPr>
+              <w:bidi/>
+              <w:cnfStyle w:val="000000000000" w:firstRow="0" w:lastRow="0" w:firstColumn="0" w:lastColumn="0" w:oddVBand="0" w:evenVBand="0" w:oddHBand="0" w:evenHBand="0" w:firstRowFirstColumn="0" w:firstRowLastColumn="0" w:lastRowFirstColumn="0" w:lastRowLastColumn="0"/>
+              <w:rPr>
+                <w:rFonts w:cs="B Nazanin"/>
+              </w:rPr>
+            </w:pPr>
+            <w:r>
+              <w:rPr>
+                <w:rFonts w:cs="B Nazanin"/>
+                <w:b/>
+                <w:bCs/>
+                <w:rtl/>
+              </w:rPr>
+              <w:t>محیط و شبکه‌سازی</w:t>
+            </w:r>
+          </w:p>
+          <w:p>
+            <w:pPr>
+              <w:numPr>
+                <w:ilvl w:val="1"/>
+                <w:numId w:val="1"/>
+              </w:numPr>
+              <w:bidi/>
+              <w:cnfStyle w:val="000000000000" w:firstRow="0" w:lastRow="0" w:firstColumn="0" w:lastColumn="0" w:oddVBand="0" w:evenVBand="0" w:oddHBand="0" w:evenHBand="0" w:firstRowFirstColumn="0" w:firstRowLastColumn="0" w:lastRowFirstColumn="0" w:lastRowLastColumn="0"/>
+              <w:rPr>
+                <w:rFonts w:cs="B Nazanin"/>
+              </w:rPr>
+            </w:pPr>
+            <w:r>
+              <w:rPr>
+                <w:rFonts w:cs="B Nazanin"/>
+                <w:rtl/>
+              </w:rPr>
+              <w:t>افراد موفق با کسانی وقت می‌گذرانند که مثبت‌اندیش، الهام‌بخش و موفق هستند</w:t>
+            </w:r>
+            <w:r>
+              <w:rPr>
+                <w:rFonts w:cs="B Nazanin"/>
+              </w:rPr>
+              <w:t>.</w:t>
+            </w:r>
+          </w:p>
+          <w:p>
+            <w:pPr>
+              <w:numPr>
+                <w:ilvl w:val="1"/>
+                <w:numId w:val="1"/>
+              </w:numPr>
+              <w:bidi/>
+              <w:cnfStyle w:val="000000000000" w:firstRow="0" w:lastRow="0" w:firstColumn="0" w:lastColumn="0" w:oddVBand="0" w:evenVBand="0" w:oddHBand="0" w:evenHBand="0" w:firstRowFirstColumn="0" w:firstRowLastColumn="0" w:lastRowFirstColumn="0" w:lastRowLastColumn="0"/>
+              <w:rPr>
+                <w:rFonts w:cs="B Nazanin"/>
+                <w:rtl/>
+              </w:rPr>
+            </w:pPr>
+            <w:r>
+              <w:rPr>
+                <w:rFonts w:cs="B Nazanin"/>
+                <w:rtl/>
+              </w:rPr>
+              <w:t>شبکه ارتباطی قوی فرصت‌های بزرگ‌تری برای رشد مالی ایجاد می‌کند</w:t>
+            </w:r>
+            <w:r>
+              <w:rPr>
+                <w:rFonts w:cs="B Nazanin"/>
+              </w:rPr>
+              <w:t>.</w:t>
+            </w:r>
+          </w:p>
+        </w:tc>
+        <w:tc>
+          <w:tcPr>
+            <w:tcW w:w="249" w:type="dxa"/>
+            <w:tcBorders>
+              <w:left w:val="nil"/>
+            </w:tcBorders>
+          </w:tcPr>
+          <w:p>
+            <w:pPr>
+              <w:bidi/>
+              <w:cnfStyle w:val="000000000000" w:firstRow="0" w:lastRow="0" w:firstColumn="0" w:lastColumn="0" w:oddVBand="0" w:evenVBand="0" w:oddHBand="0" w:evenHBand="0" w:firstRowFirstColumn="0" w:firstRowLastColumn="0" w:lastRowFirstColumn="0" w:lastRowLastColumn="0"/>
+              <w:rPr>
+                <w:rFonts w:cs="B Nazanin"/>
+                <w:rtl/>
+              </w:rPr>
+            </w:pPr>
+          </w:p>
+        </w:tc>
+      </w:tr>
+      <w:tr>
+        <w:trPr>
+          <w:cnfStyle w:val="000000100000" w:firstRow="0" w:lastRow="0" w:firstColumn="0" w:lastColumn="0" w:oddVBand="0" w:evenVBand="0" w:oddHBand="1" w:evenHBand="0" w:firstRowFirstColumn="0" w:firstRowLastColumn="0" w:lastRowFirstColumn="0" w:lastRowLastColumn="0"/>
+        </w:trPr>
+        <w:tc>
+          <w:tcPr>
+            <w:cnfStyle w:val="001000000000" w:firstRow="0" w:lastRow="0" w:firstColumn="1" w:lastColumn="0" w:oddVBand="0" w:evenVBand="0" w:oddHBand="0" w:evenHBand="0" w:firstRowFirstColumn="0" w:firstRowLastColumn="0" w:lastRowFirstColumn="0" w:lastRowLastColumn="0"/>
+            <w:tcW w:w="264" w:type="dxa"/>
+            <w:tcBorders>
+              <w:right w:val="nil"/>
+            </w:tcBorders>
+          </w:tcPr>
+          <w:p>
+            <w:pPr>
+              <w:bidi/>
+              <w:rPr>
+                <w:rFonts w:cs="B Nazanin"/>
+                <w:rtl/>
+              </w:rPr>
+            </w:pPr>
+          </w:p>
+        </w:tc>
+        <w:tc>
+          <w:tcPr>
+            <w:tcW w:w="8778" w:type="dxa"/>
+            <w:tcBorders>
+              <w:left w:val="nil"/>
+              <w:right w:val="nil"/>
+            </w:tcBorders>
+          </w:tcPr>
+          <w:p>
+            <w:pPr>
+              <w:numPr>
+                <w:ilvl w:val="0"/>
+                <w:numId w:val="1"/>
+              </w:numPr>
+              <w:bidi/>
+              <w:cnfStyle w:val="000000100000" w:firstRow="0" w:lastRow="0" w:firstColumn="0" w:lastColumn="0" w:oddVBand="0" w:evenVBand="0" w:oddHBand="1" w:evenHBand="0" w:firstRowFirstColumn="0" w:firstRowLastColumn="0" w:lastRowFirstColumn="0" w:lastRowLastColumn="0"/>
+              <w:rPr>
+                <w:rFonts w:cs="B Nazanin"/>
+              </w:rPr>
+            </w:pPr>
+            <w:r>
+              <w:rPr>
+                <w:rFonts w:cs="B Nazanin"/>
+                <w:b/>
+                <w:bCs/>
+                <w:rtl/>
+              </w:rPr>
+              <w:t>رهبری بر خود</w:t>
+            </w:r>
+          </w:p>
+          <w:p>
+            <w:pPr>
+              <w:numPr>
+                <w:ilvl w:val="1"/>
+                <w:numId w:val="1"/>
+              </w:numPr>
+              <w:bidi/>
+              <w:cnfStyle w:val="000000100000" w:firstRow="0" w:lastRow="0" w:firstColumn="0" w:lastColumn="0" w:oddVBand="0" w:evenVBand="0" w:oddHBand="1" w:evenHBand="0" w:firstRowFirstColumn="0" w:firstRowLastColumn="0" w:lastRowFirstColumn="0" w:lastRowLastColumn="0"/>
+              <w:rPr>
+                <w:rFonts w:cs="B Nazanin"/>
+              </w:rPr>
+            </w:pPr>
+            <w:r>
+              <w:rPr>
+                <w:rFonts w:cs="B Nazanin"/>
+                <w:rtl/>
+              </w:rPr>
+              <w:t>پیش از رهبری دیگران، باید خود را مدیریت کرد: زمان، انرژی، عادت‌ها و افکار</w:t>
+            </w:r>
+            <w:r>
+              <w:rPr>
+                <w:rFonts w:cs="B Nazanin"/>
+              </w:rPr>
+              <w:t>.</w:t>
+            </w:r>
+          </w:p>
+          <w:p>
+            <w:pPr>
+              <w:numPr>
+                <w:ilvl w:val="1"/>
+                <w:numId w:val="1"/>
+              </w:numPr>
+              <w:bidi/>
+              <w:cnfStyle w:val="000000100000" w:firstRow="0" w:lastRow="0" w:firstColumn="0" w:lastColumn="0" w:oddVBand="0" w:evenVBand="0" w:oddHBand="1" w:evenHBand="0" w:firstRowFirstColumn="0" w:firstRowLastColumn="0" w:lastRowFirstColumn="0" w:lastRowLastColumn="0"/>
+              <w:rPr>
+                <w:rFonts w:cs="B Nazanin"/>
+                <w:rtl/>
+              </w:rPr>
+            </w:pPr>
+            <w:r>
+              <w:rPr>
+                <w:rFonts w:cs="B Nazanin"/>
+                <w:rtl/>
+              </w:rPr>
+              <w:t>خودانضباطی پایه اصلی استقلال مالی است</w:t>
+            </w:r>
+            <w:r>
+              <w:rPr>
+                <w:rFonts w:cs="B Nazanin"/>
+              </w:rPr>
+              <w:t>.</w:t>
+            </w:r>
+          </w:p>
+        </w:tc>
+        <w:tc>
+          <w:tcPr>
+            <w:tcW w:w="249" w:type="dxa"/>
+            <w:tcBorders>
+              <w:left w:val="nil"/>
+            </w:tcBorders>
+          </w:tcPr>
+          <w:p>
+            <w:pPr>
+              <w:bidi/>
+              <w:cnfStyle w:val="000000100000" w:firstRow="0" w:lastRow="0" w:firstColumn="0" w:lastColumn="0" w:oddVBand="0" w:evenVBand="0" w:oddHBand="1" w:evenHBand="0" w:firstRowFirstColumn="0" w:firstRowLastColumn="0" w:lastRowFirstColumn="0" w:lastRowLastColumn="0"/>
+              <w:rPr>
+                <w:rFonts w:cs="B Nazanin"/>
+                <w:rtl/>
+              </w:rPr>
+            </w:pPr>
+          </w:p>
+        </w:tc>
+      </w:tr>
+      <w:tr>
+        <w:tc>
+          <w:tcPr>
+            <w:cnfStyle w:val="001000000000" w:firstRow="0" w:lastRow="0" w:firstColumn="1" w:lastColumn="0" w:oddVBand="0" w:evenVBand="0" w:oddHBand="0" w:evenHBand="0" w:firstRowFirstColumn="0" w:firstRowLastColumn="0" w:lastRowFirstColumn="0" w:lastRowLastColumn="0"/>
+            <w:tcW w:w="264" w:type="dxa"/>
+            <w:tcBorders>
+              <w:right w:val="nil"/>
+            </w:tcBorders>
+          </w:tcPr>
+          <w:p>
+            <w:pPr>
+              <w:bidi/>
+              <w:rPr>
+                <w:rFonts w:cs="B Nazanin"/>
+                <w:rtl/>
+              </w:rPr>
+            </w:pPr>
+          </w:p>
+        </w:tc>
+        <w:tc>
+          <w:tcPr>
+            <w:tcW w:w="8778" w:type="dxa"/>
+            <w:tcBorders>
+              <w:left w:val="nil"/>
+              <w:right w:val="nil"/>
+            </w:tcBorders>
+          </w:tcPr>
+          <w:p>
+            <w:pPr>
+              <w:bidi/>
+              <w:jc w:val="center"/>
+              <w:cnfStyle w:val="000000000000" w:firstRow="0" w:lastRow="0" w:firstColumn="0" w:lastColumn="0" w:oddVBand="0" w:evenVBand="0" w:oddHBand="0" w:evenHBand="0" w:firstRowFirstColumn="0" w:firstRowLastColumn="0" w:lastRowFirstColumn="0" w:lastRowLastColumn="0"/>
+              <w:rPr>
+                <w:rFonts w:cs="B Nazanin"/>
+                <w:sz w:val="36"/>
+                <w:szCs w:val="36"/>
+                <w:rtl/>
+              </w:rPr>
+            </w:pPr>
+            <w:r>
+              <w:rPr>
+                <w:rFonts w:cs="B Nazanin"/>
+                <w:sz w:val="36"/>
+                <w:szCs w:val="36"/>
+                <w:rtl/>
+              </w:rPr>
+              <w:t xml:space="preserve">جمع‌بندی: برایان تریسی تاکید می‌کند که </w:t>
+            </w:r>
+            <w:r>
+              <w:rPr>
+                <w:rFonts w:cs="B Nazanin"/>
+                <w:b/>
+                <w:bCs/>
+                <w:sz w:val="36"/>
+                <w:szCs w:val="36"/>
+                <w:rtl/>
+              </w:rPr>
+              <w:t>خلق ثروت ترکیبی از نگرش درست، هدف‌گذاری دقیق، مدیریت مالی هوشمند، یادگیری مداوم و پشتکار</w:t>
+            </w:r>
+            <w:r>
+              <w:rPr>
+                <w:rFonts w:cs="B Nazanin"/>
+                <w:sz w:val="36"/>
+                <w:szCs w:val="36"/>
+                <w:rtl/>
+              </w:rPr>
+              <w:t xml:space="preserve"> است</w:t>
+            </w:r>
+            <w:r>
+              <w:rPr>
+                <w:rFonts w:cs="B Nazanin"/>
+                <w:sz w:val="36"/>
+                <w:szCs w:val="36"/>
+              </w:rPr>
+              <w:t>.</w:t>
+            </w:r>
+          </w:p>
+        </w:tc>
+        <w:tc>
+          <w:tcPr>
+            <w:tcW w:w="249" w:type="dxa"/>
+            <w:tcBorders>
+              <w:left w:val="nil"/>
+            </w:tcBorders>
+          </w:tcPr>
+          <w:p>
+            <w:pPr>
+              <w:bidi/>
+              <w:cnfStyle w:val="000000000000" w:firstRow="0" w:lastRow="0" w:firstColumn="0" w:lastColumn="0" w:oddVBand="0" w:evenVBand="0" w:oddHBand="0" w:evenHBand="0" w:firstRowFirstColumn="0" w:firstRowLastColumn="0" w:lastRowFirstColumn="0" w:lastRowLastColumn="0"/>
+              <w:rPr>
+                <w:rFonts w:cs="B Nazanin"/>
+                <w:rtl/>
+              </w:rPr>
+            </w:pPr>
+          </w:p>
+        </w:tc>
+      </w:tr>
+      <w:tr>
+        <w:trPr>
+          <w:cnfStyle w:val="000000100000" w:firstRow="0" w:lastRow="0" w:firstColumn="0" w:lastColumn="0" w:oddVBand="0" w:evenVBand="0" w:oddHBand="1" w:evenHBand="0" w:firstRowFirstColumn="0" w:firstRowLastColumn="0" w:lastRowFirstColumn="0" w:lastRowLastColumn="0"/>
+        </w:trPr>
+        <w:tc>
+          <w:tcPr>
+            <w:cnfStyle w:val="001000000000" w:firstRow="0" w:lastRow="0" w:firstColumn="1" w:lastColumn="0" w:oddVBand="0" w:evenVBand="0" w:oddHBand="0" w:evenHBand="0" w:firstRowFirstColumn="0" w:firstRowLastColumn="0" w:lastRowFirstColumn="0" w:lastRowLastColumn="0"/>
+            <w:tcW w:w="264" w:type="dxa"/>
+            <w:tcBorders>
+              <w:right w:val="nil"/>
+            </w:tcBorders>
+          </w:tcPr>
+          <w:p>
+            <w:pPr>
+              <w:bidi/>
+              <w:rPr>
+                <w:rFonts w:cs="B Nazanin"/>
+                <w:rtl/>
+              </w:rPr>
+            </w:pPr>
+          </w:p>
+        </w:tc>
+        <w:tc>
+          <w:tcPr>
+            <w:tcW w:w="8778" w:type="dxa"/>
+            <w:tcBorders>
+              <w:left w:val="nil"/>
+              <w:right w:val="nil"/>
+            </w:tcBorders>
+          </w:tcPr>
+          <w:p>
+            <w:pPr>
+              <w:bidi/>
+              <w:cnfStyle w:val="000000100000" w:firstRow="0" w:lastRow="0" w:firstColumn="0" w:lastColumn="0" w:oddVBand="0" w:evenVBand="0" w:oddHBand="1" w:evenHBand="0" w:firstRowFirstColumn="0" w:firstRowLastColumn="0" w:lastRowFirstColumn="0" w:lastRowLastColumn="0"/>
+              <w:rPr>
+                <w:rFonts w:cs="B Nazanin"/>
+                <w:rtl/>
+              </w:rPr>
+            </w:pPr>
+          </w:p>
+        </w:tc>
+        <w:tc>
+          <w:tcPr>
+            <w:tcW w:w="249" w:type="dxa"/>
+            <w:tcBorders>
+              <w:left w:val="nil"/>
+            </w:tcBorders>
+          </w:tcPr>
+          <w:p>
+            <w:pPr>
+              <w:bidi/>
+              <w:cnfStyle w:val="000000100000" w:firstRow="0" w:lastRow="0" w:firstColumn="0" w:lastColumn="0" w:oddVBand="0" w:evenVBand="0" w:oddHBand="1" w:evenHBand="0" w:firstRowFirstColumn="0" w:firstRowLastColumn="0" w:lastRowFirstColumn="0" w:lastRowLastColumn="0"/>
+              <w:rPr>
+                <w:rFonts w:cs="B Nazanin"/>
+                <w:rtl/>
+              </w:rPr>
+            </w:pPr>
+          </w:p>
+        </w:tc>
+      </w:tr>
+    </w:tbl>
     <w:p>
       <w:pPr>
         <w:bidi/>
@@ -1320,6 +2045,7 @@
   <w:style w:type="character" w:default="1" w:styleId="DefaultParagraphFont">
     <w:name w:val="Default Paragraph Font"/>
     <w:uiPriority w:val="1"/>
+    <w:semiHidden/>
     <w:unhideWhenUsed/>
   </w:style>
   <w:style w:type="table" w:default="1" w:styleId="TableNormal">
@@ -1632,6 +2358,101 @@
       <w:color w:val="2F5496" w:themeColor="accent1" w:themeShade="BF"/>
       <w:spacing w:val="5"/>
     </w:rPr>
+  </w:style>
+  <w:style w:type="table" w:styleId="TableGrid">
+    <w:name w:val="Table Grid"/>
+    <w:basedOn w:val="TableNormal"/>
+    <w:uiPriority w:val="39"/>
+    <w:rsid w:val="0064688E"/>
+    <w:pPr>
+      <w:spacing w:after="0" w:line="240" w:lineRule="auto"/>
+    </w:pPr>
+    <w:tblPr>
+      <w:tblBorders>
+        <w:top w:val="single" w:sz="4" w:space="0" w:color="auto"/>
+        <w:left w:val="single" w:sz="4" w:space="0" w:color="auto"/>
+        <w:bottom w:val="single" w:sz="4" w:space="0" w:color="auto"/>
+        <w:right w:val="single" w:sz="4" w:space="0" w:color="auto"/>
+        <w:insideH w:val="single" w:sz="4" w:space="0" w:color="auto"/>
+        <w:insideV w:val="single" w:sz="4" w:space="0" w:color="auto"/>
+      </w:tblBorders>
+    </w:tblPr>
+  </w:style>
+  <w:style w:type="table" w:styleId="GridTable4-Accent6">
+    <w:name w:val="Grid Table 4 Accent 6"/>
+    <w:basedOn w:val="TableNormal"/>
+    <w:uiPriority w:val="49"/>
+    <w:rsid w:val="0064688E"/>
+    <w:pPr>
+      <w:spacing w:after="0" w:line="240" w:lineRule="auto"/>
+    </w:pPr>
+    <w:tblPr>
+      <w:tblStyleRowBandSize w:val="1"/>
+      <w:tblStyleColBandSize w:val="1"/>
+      <w:tblBorders>
+        <w:top w:val="single" w:sz="4" w:space="0" w:color="A8D08D" w:themeColor="accent6" w:themeTint="99"/>
+        <w:left w:val="single" w:sz="4" w:space="0" w:color="A8D08D" w:themeColor="accent6" w:themeTint="99"/>
+        <w:bottom w:val="single" w:sz="4" w:space="0" w:color="A8D08D" w:themeColor="accent6" w:themeTint="99"/>
+        <w:right w:val="single" w:sz="4" w:space="0" w:color="A8D08D" w:themeColor="accent6" w:themeTint="99"/>
+        <w:insideH w:val="single" w:sz="4" w:space="0" w:color="A8D08D" w:themeColor="accent6" w:themeTint="99"/>
+        <w:insideV w:val="single" w:sz="4" w:space="0" w:color="A8D08D" w:themeColor="accent6" w:themeTint="99"/>
+      </w:tblBorders>
+    </w:tblPr>
+    <w:tblStylePr w:type="firstRow">
+      <w:rPr>
+        <w:b/>
+        <w:bCs/>
+        <w:color w:val="FFFFFF" w:themeColor="background1"/>
+      </w:rPr>
+      <w:tblPr/>
+      <w:tcPr>
+        <w:tcBorders>
+          <w:top w:val="single" w:sz="4" w:space="0" w:color="70AD47" w:themeColor="accent6"/>
+          <w:left w:val="single" w:sz="4" w:space="0" w:color="70AD47" w:themeColor="accent6"/>
+          <w:bottom w:val="single" w:sz="4" w:space="0" w:color="70AD47" w:themeColor="accent6"/>
+          <w:right w:val="single" w:sz="4" w:space="0" w:color="70AD47" w:themeColor="accent6"/>
+          <w:insideH w:val="nil"/>
+          <w:insideV w:val="nil"/>
+        </w:tcBorders>
+        <w:shd w:val="clear" w:color="auto" w:fill="70AD47" w:themeFill="accent6"/>
+      </w:tcPr>
+    </w:tblStylePr>
+    <w:tblStylePr w:type="lastRow">
+      <w:rPr>
+        <w:b/>
+        <w:bCs/>
+      </w:rPr>
+      <w:tblPr/>
+      <w:tcPr>
+        <w:tcBorders>
+          <w:top w:val="double" w:sz="4" w:space="0" w:color="70AD47" w:themeColor="accent6"/>
+        </w:tcBorders>
+      </w:tcPr>
+    </w:tblStylePr>
+    <w:tblStylePr w:type="firstCol">
+      <w:rPr>
+        <w:b/>
+        <w:bCs/>
+      </w:rPr>
+    </w:tblStylePr>
+    <w:tblStylePr w:type="lastCol">
+      <w:rPr>
+        <w:b/>
+        <w:bCs/>
+      </w:rPr>
+    </w:tblStylePr>
+    <w:tblStylePr w:type="band1Vert">
+      <w:tblPr/>
+      <w:tcPr>
+        <w:shd w:val="clear" w:color="auto" w:fill="E2EFD9" w:themeFill="accent6" w:themeFillTint="33"/>
+      </w:tcPr>
+    </w:tblStylePr>
+    <w:tblStylePr w:type="band1Horz">
+      <w:tblPr/>
+      <w:tcPr>
+        <w:shd w:val="clear" w:color="auto" w:fill="E2EFD9" w:themeFill="accent6" w:themeFillTint="33"/>
+      </w:tcPr>
+    </w:tblStylePr>
   </w:style>
 </w:styles>
 </file>

</xml_diff>